<commit_message>
v7: reubica puntos Fase 2 y 3, reordena Cuestionario y Planificación
- Puntos 2 y 3 de Fase 2 (gobernanza y actores informales) pasan a
  Fase 3 como puntos 2 y 3, tras el muestreo inclusivo.
- En Fase 2, el Cuestionario sube al punto 4 y la Planificación de
  la convocatoria queda como punto 5, después del diagnóstico.
- Renumeración completa de Fase 2 (6 puntos) y Fase 3 (11 puntos).
</commit_message>
<xml_diff>
--- a/CRV_Orientaciones_Acceso_y_Legitimacion_2026_v7.docx
+++ b/CRV_Orientaciones_Acceso_y_Legitimacion_2026_v7.docx
@@ -4729,8 +4729,6 @@
         <w:pStyle w:val="Ttulo2"/>
         <w:rPr>
           <w:rFonts w:ascii="Arial" w:hAnsi="Arial" w:cs="Arial"/>
-          <w:b/>
-          <w:bCs/>
           <w:color w:val="auto"/>
           <w:sz w:val="22"/>
           <w:szCs w:val="22"/>
@@ -4747,626 +4745,7 @@
           <w:szCs w:val="22"/>
           <w:lang w:val="es-ES"/>
         </w:rPr>
-        <w:t xml:space="preserve">2. </w:t>
-      </w:r>
-      <w:r>
-        <w:rPr>
-          <w:rFonts w:ascii="Arial" w:hAnsi="Arial" w:cs="Arial"/>
-          <w:b/>
-          <w:bCs/>
-          <w:color w:val="auto"/>
-          <w:sz w:val="22"/>
-          <w:szCs w:val="22"/>
-          <w:lang w:val="es-ES"/>
-        </w:rPr>
-        <w:t>Mapeo de gobernanza</w:t>
-      </w:r>
-      <w:r>
-        <w:rPr>
-          <w:rFonts w:ascii="Arial" w:hAnsi="Arial" w:cs="Arial"/>
-          <w:b/>
-          <w:bCs/>
-          <w:color w:val="auto"/>
-          <w:sz w:val="22"/>
-          <w:szCs w:val="22"/>
-          <w:lang w:val="es-ES"/>
-        </w:rPr>
-        <w:t>, relaciones económicas</w:t>
-      </w:r>
-      <w:r>
-        <w:rPr>
-          <w:rFonts w:ascii="Arial" w:hAnsi="Arial" w:cs="Arial"/>
-          <w:b/>
-          <w:bCs/>
-          <w:color w:val="auto"/>
-          <w:sz w:val="22"/>
-          <w:szCs w:val="22"/>
-          <w:lang w:val="es-ES"/>
-        </w:rPr>
-        <w:t xml:space="preserve"> y poder real</w:t>
-      </w:r>
-    </w:p>
-    <w:p>
-      <w:pPr>
-        <w:numPr>
-          <w:ilvl w:val="0"/>
-          <w:numId w:val="6"/>
-        </w:numPr>
-        <w:jc w:val="both"/>
-        <w:rPr>
-          <w:rFonts w:ascii="Arial" w:hAnsi="Arial" w:cs="Arial"/>
-          <w:sz w:val="22"/>
-          <w:szCs w:val="22"/>
-          <w:lang w:val="es-ES"/>
-        </w:rPr>
-      </w:pPr>
-      <w:r>
-        <w:rPr>
-          <w:rFonts w:ascii="Arial" w:hAnsi="Arial" w:cs="Arial"/>
-          <w:b/>
-          <w:bCs/>
-          <w:sz w:val="22"/>
-          <w:szCs w:val="22"/>
-          <w:lang w:val="es-ES"/>
-        </w:rPr>
-        <w:t>Acción:</w:t>
-      </w:r>
-      <w:r>
-        <w:rPr>
-          <w:rFonts w:ascii="Arial" w:hAnsi="Arial" w:cs="Arial"/>
-          <w:sz w:val="22"/>
-          <w:szCs w:val="22"/>
-          <w:lang w:val="es-ES"/>
-        </w:rPr>
-        <w:t xml:space="preserve"> </w:t>
-      </w:r>
-      <w:r>
-        <w:rPr>
-          <w:rFonts w:ascii="Arial" w:hAnsi="Arial" w:cs="Arial"/>
-          <w:sz w:val="22"/>
-          <w:szCs w:val="22"/>
-        </w:rPr>
-        <w:t>Registrar</w:t>
-      </w:r>
-      <w:r>
-        <w:rPr>
-          <w:rFonts w:ascii="Arial" w:hAnsi="Arial" w:cs="Arial"/>
-          <w:sz w:val="22"/>
-          <w:szCs w:val="22"/>
-        </w:rPr>
-        <w:t xml:space="preserve"> cómo se toman las decisiones (consensos, asambleas o jerarquías)</w:t>
-      </w:r>
-      <w:r>
-        <w:rPr>
-          <w:rFonts w:ascii="Arial" w:hAnsi="Arial" w:cs="Arial"/>
-          <w:sz w:val="22"/>
-          <w:szCs w:val="22"/>
-        </w:rPr>
-        <w:t xml:space="preserve">, </w:t>
-      </w:r>
-      <w:r>
-        <w:rPr>
-          <w:rFonts w:ascii="Arial" w:hAnsi="Arial" w:cs="Arial"/>
-          <w:sz w:val="22"/>
-          <w:szCs w:val="22"/>
-        </w:rPr>
-        <w:t xml:space="preserve">qué redes de intercambio </w:t>
-      </w:r>
-      <w:r>
-        <w:rPr>
-          <w:rFonts w:ascii="Arial" w:hAnsi="Arial" w:cs="Arial"/>
-          <w:sz w:val="22"/>
-          <w:szCs w:val="22"/>
-        </w:rPr>
-        <w:t xml:space="preserve">existen </w:t>
-      </w:r>
-      <w:r>
-        <w:rPr>
-          <w:rFonts w:ascii="Arial" w:hAnsi="Arial" w:cs="Arial"/>
-          <w:sz w:val="22"/>
-          <w:szCs w:val="22"/>
-        </w:rPr>
-        <w:t xml:space="preserve">y si las mismas están basadas en lazos </w:t>
-      </w:r>
-      <w:r>
-        <w:rPr>
-          <w:rFonts w:ascii="Arial" w:hAnsi="Arial" w:cs="Arial"/>
-          <w:sz w:val="22"/>
-          <w:szCs w:val="22"/>
-        </w:rPr>
-        <w:t xml:space="preserve">familiares </w:t>
-      </w:r>
-      <w:r>
-        <w:rPr>
-          <w:rFonts w:ascii="Arial" w:hAnsi="Arial" w:cs="Arial"/>
-          <w:sz w:val="22"/>
-          <w:szCs w:val="22"/>
-        </w:rPr>
-        <w:t>extendidos, vecinales</w:t>
-      </w:r>
-      <w:r>
-        <w:rPr>
-          <w:rFonts w:ascii="Arial" w:hAnsi="Arial" w:cs="Arial"/>
-          <w:sz w:val="22"/>
-          <w:szCs w:val="22"/>
-        </w:rPr>
-        <w:t>,</w:t>
-      </w:r>
-      <w:r>
-        <w:rPr>
-          <w:rFonts w:ascii="Arial" w:hAnsi="Arial" w:cs="Arial"/>
-          <w:sz w:val="22"/>
-          <w:szCs w:val="22"/>
-        </w:rPr>
-        <w:t xml:space="preserve"> </w:t>
-      </w:r>
-      <w:r>
-        <w:rPr>
-          <w:rFonts w:ascii="Arial" w:hAnsi="Arial" w:cs="Arial"/>
-          <w:sz w:val="22"/>
-          <w:szCs w:val="22"/>
-        </w:rPr>
-        <w:t>amistad</w:t>
-      </w:r>
-      <w:r>
-        <w:rPr>
-          <w:rFonts w:ascii="Arial" w:hAnsi="Arial" w:cs="Arial"/>
-          <w:sz w:val="22"/>
-          <w:szCs w:val="22"/>
-        </w:rPr>
-        <w:t xml:space="preserve"> o</w:t>
-      </w:r>
-      <w:r>
-        <w:rPr>
-          <w:rFonts w:ascii="Arial" w:hAnsi="Arial" w:cs="Arial"/>
-          <w:sz w:val="22"/>
-          <w:szCs w:val="22"/>
-        </w:rPr>
-        <w:t xml:space="preserve"> burocracia del Estado</w:t>
-      </w:r>
-      <w:r>
-        <w:rPr>
-          <w:rFonts w:ascii="Arial" w:hAnsi="Arial" w:cs="Arial"/>
-          <w:sz w:val="22"/>
-          <w:szCs w:val="22"/>
-        </w:rPr>
-        <w:t xml:space="preserve">. </w:t>
-      </w:r>
-    </w:p>
-    <w:p>
-      <w:pPr>
-        <w:numPr>
-          <w:ilvl w:val="0"/>
-          <w:numId w:val="6"/>
-        </w:numPr>
-        <w:jc w:val="both"/>
-        <w:rPr>
-          <w:rFonts w:ascii="Arial" w:hAnsi="Arial" w:cs="Arial"/>
-          <w:sz w:val="22"/>
-          <w:szCs w:val="22"/>
-        </w:rPr>
-      </w:pPr>
-      <w:r>
-        <w:rPr>
-          <w:rFonts w:ascii="Arial" w:hAnsi="Arial" w:cs="Arial"/>
-          <w:b/>
-          <w:bCs/>
-          <w:sz w:val="22"/>
-          <w:szCs w:val="22"/>
-        </w:rPr>
-        <w:t>Herramienta:</w:t>
-      </w:r>
-      <w:r>
-        <w:rPr>
-          <w:rFonts w:ascii="Arial" w:hAnsi="Arial" w:cs="Arial"/>
-          <w:sz w:val="22"/>
-          <w:szCs w:val="22"/>
-        </w:rPr>
-        <w:t xml:space="preserve"> </w:t>
-      </w:r>
-      <w:r>
-        <w:rPr>
-          <w:rFonts w:ascii="Arial" w:hAnsi="Arial" w:cs="Arial"/>
-          <w:sz w:val="22"/>
-          <w:szCs w:val="22"/>
-        </w:rPr>
-        <w:t xml:space="preserve">Sociograma de Redes de Influencia para mapear los flujos de poder y la autoridad moral dentro de la comunidad. </w:t>
-      </w:r>
-    </w:p>
-    <w:p>
-      <w:pPr>
-        <w:pStyle w:val="Ttulo2"/>
-        <w:rPr>
-          <w:rFonts w:ascii="Arial" w:hAnsi="Arial" w:cs="Arial"/>
-          <w:b/>
-          <w:bCs/>
-          <w:color w:val="auto"/>
-          <w:sz w:val="22"/>
-          <w:szCs w:val="22"/>
-          <w:lang w:val="es-ES"/>
-        </w:rPr>
-      </w:pPr>
-      <w:r>
-        <w:rPr>
-          <w:rFonts w:ascii="Arial" w:hAnsi="Arial" w:cs="Arial"/>
-          <w:b/>
-          <w:bCs/>
-          <w:color w:val="auto"/>
-          <w:sz w:val="22"/>
-          <w:szCs w:val="22"/>
-          <w:lang w:val="es-ES"/>
-        </w:rPr>
-        <w:t xml:space="preserve">3. </w:t>
-      </w:r>
-      <w:r>
-        <w:rPr>
-          <w:rFonts w:ascii="Arial" w:hAnsi="Arial" w:cs="Arial"/>
-          <w:b/>
-          <w:bCs/>
-          <w:color w:val="auto"/>
-          <w:sz w:val="22"/>
-          <w:szCs w:val="22"/>
-          <w:lang w:val="es-ES"/>
-        </w:rPr>
-        <w:t>Identificación y gestión de actores de poder informal</w:t>
-      </w:r>
-    </w:p>
-    <w:p>
-      <w:pPr>
-        <w:jc w:val="both"/>
-        <w:rPr>
-          <w:rFonts w:ascii="Arial" w:hAnsi="Arial" w:cs="Arial"/>
-          <w:sz w:val="22"/>
-          <w:szCs w:val="22"/>
-          <w:lang w:val="es-ES"/>
-        </w:rPr>
-      </w:pPr>
-      <w:r>
-        <w:rPr>
-          <w:rFonts w:ascii="Arial" w:hAnsi="Arial" w:cs="Arial"/>
-          <w:b/>
-          <w:bCs/>
-          <w:sz w:val="22"/>
-          <w:szCs w:val="22"/>
-          <w:lang w:val="es-ES"/>
-        </w:rPr>
-        <w:t>Acción:</w:t>
-      </w:r>
-      <w:r>
-        <w:rPr>
-          <w:rFonts w:ascii="Arial" w:hAnsi="Arial" w:cs="Arial"/>
-          <w:sz w:val="22"/>
-          <w:szCs w:val="22"/>
-          <w:lang w:val="es-ES"/>
-        </w:rPr>
-        <w:t> El mapeo de gobernanza permite identificar la estructura formal del liderazgo, pero en muchas comunidades existen actores de poder informal —grupos irregulares, líderes políticos sin cargo explícito, redes de control económico o territorial— que no aparecen en los mapeos previos y que pueden incidir directamente sobre la viabilidad del proyecto. La filial debe desarrollar sensibilidad para detectarlos desde la primera visita.</w:t>
-      </w:r>
-    </w:p>
-    <w:p>
-      <w:pPr>
-        <w:jc w:val="both"/>
-        <w:rPr>
-          <w:rFonts w:ascii="Arial" w:hAnsi="Arial" w:cs="Arial"/>
-          <w:b/>
-          <w:bCs/>
-          <w:sz w:val="22"/>
-          <w:szCs w:val="22"/>
-          <w:lang w:val="es-ES"/>
-        </w:rPr>
-      </w:pPr>
-      <w:r>
-        <w:rPr>
-          <w:rFonts w:ascii="Arial" w:hAnsi="Arial" w:cs="Arial"/>
-          <w:b/>
-          <w:bCs/>
-          <w:sz w:val="22"/>
-          <w:szCs w:val="22"/>
-          <w:lang w:val="es-ES"/>
-        </w:rPr>
-        <w:t>Señales de alerta:</w:t>
-      </w:r>
-    </w:p>
-    <w:p>
-      <w:pPr>
-        <w:numPr>
-          <w:ilvl w:val="0"/>
-          <w:numId w:val="33"/>
-        </w:numPr>
-        <w:jc w:val="both"/>
-        <w:rPr>
-          <w:rFonts w:ascii="Arial" w:hAnsi="Arial" w:cs="Arial"/>
-          <w:sz w:val="22"/>
-          <w:szCs w:val="22"/>
-          <w:lang w:val="es-ES"/>
-        </w:rPr>
-      </w:pPr>
-      <w:r>
-        <w:rPr>
-          <w:rFonts w:ascii="Arial" w:hAnsi="Arial" w:cs="Arial"/>
-          <w:sz w:val="22"/>
-          <w:szCs w:val="22"/>
-          <w:lang w:val="es-ES"/>
-        </w:rPr>
-        <w:lastRenderedPageBreak/>
-        <w:t>Personas sin cargo formal a quienes el liderazgo consulta o pide aprobación antes de tomar decisiones.</w:t>
-      </w:r>
-    </w:p>
-    <w:p>
-      <w:pPr>
-        <w:numPr>
-          <w:ilvl w:val="0"/>
-          <w:numId w:val="33"/>
-        </w:numPr>
-        <w:jc w:val="both"/>
-        <w:rPr>
-          <w:rFonts w:ascii="Arial" w:hAnsi="Arial" w:cs="Arial"/>
-          <w:sz w:val="22"/>
-          <w:szCs w:val="22"/>
-          <w:lang w:val="es-ES"/>
-        </w:rPr>
-      </w:pPr>
-      <w:r>
-        <w:rPr>
-          <w:rFonts w:ascii="Arial" w:hAnsi="Arial" w:cs="Arial"/>
-          <w:sz w:val="22"/>
-          <w:szCs w:val="22"/>
-          <w:lang w:val="es-ES"/>
-        </w:rPr>
-        <w:t>Referencias veladas a "permisos" o "acuerdos" que deben gestionarse fuera de los canales formales.</w:t>
-      </w:r>
-    </w:p>
-    <w:p>
-      <w:pPr>
-        <w:numPr>
-          <w:ilvl w:val="0"/>
-          <w:numId w:val="33"/>
-        </w:numPr>
-        <w:jc w:val="both"/>
-        <w:rPr>
-          <w:rFonts w:ascii="Arial" w:hAnsi="Arial" w:cs="Arial"/>
-          <w:sz w:val="22"/>
-          <w:szCs w:val="22"/>
-          <w:lang w:val="es-ES"/>
-        </w:rPr>
-      </w:pPr>
-      <w:r>
-        <w:rPr>
-          <w:rFonts w:ascii="Arial" w:hAnsi="Arial" w:cs="Arial"/>
-          <w:sz w:val="22"/>
-          <w:szCs w:val="22"/>
-          <w:lang w:val="es-ES"/>
-        </w:rPr>
-        <w:t>Cambios repentinos de actitud del liderazgo sin explicación aparente.</w:t>
-      </w:r>
-    </w:p>
-    <w:p>
-      <w:pPr>
-        <w:numPr>
-          <w:ilvl w:val="0"/>
-          <w:numId w:val="33"/>
-        </w:numPr>
-        <w:jc w:val="both"/>
-        <w:rPr>
-          <w:rFonts w:ascii="Arial" w:hAnsi="Arial" w:cs="Arial"/>
-          <w:sz w:val="22"/>
-          <w:szCs w:val="22"/>
-          <w:lang w:val="es-ES"/>
-        </w:rPr>
-      </w:pPr>
-      <w:r>
-        <w:rPr>
-          <w:rFonts w:ascii="Arial" w:hAnsi="Arial" w:cs="Arial"/>
-          <w:sz w:val="22"/>
-          <w:szCs w:val="22"/>
-          <w:lang w:val="es-ES"/>
-        </w:rPr>
-        <w:t>Restricciones espontáneas sobre ciertos espacios físicos, horarios o temas de conversación.</w:t>
-      </w:r>
-    </w:p>
-    <w:p>
-      <w:pPr>
-        <w:numPr>
-          <w:ilvl w:val="0"/>
-          <w:numId w:val="33"/>
-        </w:numPr>
-        <w:jc w:val="both"/>
-        <w:rPr>
-          <w:rFonts w:ascii="Arial" w:hAnsi="Arial" w:cs="Arial"/>
-          <w:sz w:val="22"/>
-          <w:szCs w:val="22"/>
-          <w:lang w:val="es-ES"/>
-        </w:rPr>
-      </w:pPr>
-      <w:r>
-        <w:rPr>
-          <w:rFonts w:ascii="Arial" w:hAnsi="Arial" w:cs="Arial"/>
-          <w:sz w:val="22"/>
-          <w:szCs w:val="22"/>
-          <w:lang w:val="es-ES"/>
-        </w:rPr>
-        <w:t>Presencia de personas no identificadas que observan las actividades sin participar.</w:t>
-      </w:r>
-    </w:p>
-    <w:p>
-      <w:pPr>
-        <w:jc w:val="both"/>
-        <w:rPr>
-          <w:rFonts w:ascii="Arial" w:hAnsi="Arial" w:cs="Arial"/>
-          <w:b/>
-          <w:bCs/>
-          <w:sz w:val="22"/>
-          <w:szCs w:val="22"/>
-          <w:lang w:val="es-ES"/>
-        </w:rPr>
-      </w:pPr>
-      <w:r>
-        <w:rPr>
-          <w:rFonts w:ascii="Arial" w:hAnsi="Arial" w:cs="Arial"/>
-          <w:b/>
-          <w:bCs/>
-          <w:sz w:val="22"/>
-          <w:szCs w:val="22"/>
-          <w:lang w:val="es-ES"/>
-        </w:rPr>
-        <w:t>Protocolo de neutralidad:</w:t>
-      </w:r>
-    </w:p>
-    <w:p>
-      <w:pPr>
-        <w:numPr>
-          <w:ilvl w:val="0"/>
-          <w:numId w:val="34"/>
-        </w:numPr>
-        <w:jc w:val="both"/>
-        <w:rPr>
-          <w:rFonts w:ascii="Arial" w:hAnsi="Arial" w:cs="Arial"/>
-          <w:sz w:val="22"/>
-          <w:szCs w:val="22"/>
-          <w:lang w:val="es-ES"/>
-        </w:rPr>
-      </w:pPr>
-      <w:r>
-        <w:rPr>
-          <w:rFonts w:ascii="Arial" w:hAnsi="Arial" w:cs="Arial"/>
-          <w:sz w:val="22"/>
-          <w:szCs w:val="22"/>
-          <w:lang w:val="es-ES"/>
-        </w:rPr>
-        <w:t>No tomar partido ni alinearse públicamente con ningún actor de poder —formal o informal— que tenga disputas internas dentro de la comunidad.</w:t>
-      </w:r>
-    </w:p>
-    <w:p>
-      <w:pPr>
-        <w:numPr>
-          <w:ilvl w:val="0"/>
-          <w:numId w:val="34"/>
-        </w:numPr>
-        <w:jc w:val="both"/>
-        <w:rPr>
-          <w:rFonts w:ascii="Arial" w:hAnsi="Arial" w:cs="Arial"/>
-          <w:sz w:val="22"/>
-          <w:szCs w:val="22"/>
-          <w:lang w:val="es-ES"/>
-        </w:rPr>
-      </w:pPr>
-      <w:r>
-        <w:rPr>
-          <w:rFonts w:ascii="Arial" w:hAnsi="Arial" w:cs="Arial"/>
-          <w:sz w:val="22"/>
-          <w:szCs w:val="22"/>
-          <w:lang w:val="es-ES"/>
-        </w:rPr>
-        <w:t>Evitar que el proyecto sea asociado con una facción política, económica o social específica.</w:t>
-      </w:r>
-    </w:p>
-    <w:p>
-      <w:pPr>
-        <w:numPr>
-          <w:ilvl w:val="0"/>
-          <w:numId w:val="34"/>
-        </w:numPr>
-        <w:jc w:val="both"/>
-        <w:rPr>
-          <w:rFonts w:ascii="Arial" w:hAnsi="Arial" w:cs="Arial"/>
-          <w:sz w:val="22"/>
-          <w:szCs w:val="22"/>
-          <w:lang w:val="es-ES"/>
-        </w:rPr>
-      </w:pPr>
-      <w:r>
-        <w:rPr>
-          <w:rFonts w:ascii="Arial" w:hAnsi="Arial" w:cs="Arial"/>
-          <w:sz w:val="22"/>
-          <w:szCs w:val="22"/>
-          <w:lang w:val="es-ES"/>
-        </w:rPr>
-        <w:t>Si un actor informal condiciona el acceso o la continuidad del proyecto, documentar el hecho internamente y escalar a la coordinación de la filial antes de tomar cualquier decisión.</w:t>
-      </w:r>
-    </w:p>
-    <w:p>
-      <w:pPr>
-        <w:jc w:val="both"/>
-        <w:rPr>
-          <w:rFonts w:ascii="Arial" w:hAnsi="Arial" w:cs="Arial"/>
-          <w:sz w:val="22"/>
-          <w:szCs w:val="22"/>
-          <w:lang w:val="es-ES"/>
-        </w:rPr>
-      </w:pPr>
-      <w:r>
-        <w:rPr>
-          <w:rFonts w:ascii="Arial" w:hAnsi="Arial" w:cs="Arial"/>
-          <w:b/>
-          <w:bCs/>
-          <w:sz w:val="22"/>
-          <w:szCs w:val="22"/>
-          <w:lang w:val="es-ES"/>
-        </w:rPr>
-        <w:t>Estrategia de campo:</w:t>
-      </w:r>
-      <w:r>
-        <w:rPr>
-          <w:rFonts w:ascii="Arial" w:hAnsi="Arial" w:cs="Arial"/>
-          <w:sz w:val="22"/>
-          <w:szCs w:val="22"/>
-          <w:lang w:val="es-ES"/>
-        </w:rPr>
-        <w:t> Ante la presencia de actores de poder informal, la postura de la filial es de observación activa y no confrontación. El objetivo es comprender su rol sin reconocerlo públicamente ni ceder ante condiciones que comprometan la neutralidad institucional o la seguridad del equipo.</w:t>
-      </w:r>
-    </w:p>
-    <w:p>
-      <w:pPr>
-        <w:jc w:val="both"/>
-        <w:rPr>
-          <w:rFonts w:ascii="Arial" w:hAnsi="Arial" w:cs="Arial"/>
-          <w:sz w:val="22"/>
-          <w:szCs w:val="22"/>
-          <w:lang w:val="es-ES"/>
-        </w:rPr>
-      </w:pPr>
-      <w:r>
-        <w:rPr>
-          <w:rFonts w:ascii="Arial" w:hAnsi="Arial" w:cs="Arial"/>
-          <w:b/>
-          <w:bCs/>
-          <w:sz w:val="22"/>
-          <w:szCs w:val="22"/>
-          <w:lang w:val="es-ES"/>
-        </w:rPr>
-        <w:t>Punto crítico:</w:t>
-      </w:r>
-      <w:r>
-        <w:rPr>
-          <w:rFonts w:ascii="Arial" w:hAnsi="Arial" w:cs="Arial"/>
-          <w:sz w:val="22"/>
-          <w:szCs w:val="22"/>
-          <w:lang w:val="es-ES"/>
-        </w:rPr>
-        <w:t> Identificar a estos actores no equivale a negociar con ellos. La CRV no reconoce como interlocutores válidos a actores cuya autoridad se basa en el control territorial por medios no legítimos. Si su presencia representa un riesgo para el equipo o la comunidad, debe activarse el protocolo de seguridad de la filial.</w:t>
-      </w:r>
-    </w:p>
-    <w:p>
-      <w:pPr>
-        <w:pStyle w:val="Ttulo2"/>
-        <w:rPr>
-          <w:rFonts w:ascii="Arial" w:hAnsi="Arial" w:cs="Arial"/>
-          <w:color w:val="auto"/>
-          <w:sz w:val="22"/>
-          <w:szCs w:val="22"/>
-          <w:lang w:val="es-ES"/>
-        </w:rPr>
-      </w:pPr>
-      <w:r>
-        <w:rPr>
-          <w:rFonts w:ascii="Arial" w:hAnsi="Arial" w:cs="Arial"/>
-          <w:b/>
-          <w:bCs/>
-          <w:color w:val="auto"/>
-          <w:sz w:val="22"/>
-          <w:szCs w:val="22"/>
-          <w:lang w:val="es-ES"/>
-        </w:rPr>
-        <w:t>4</w:t>
+        <w:t>2</w:t>
       </w:r>
       <w:r>
         <w:rPr>
@@ -6134,7 +5513,7 @@
           <w:szCs w:val="22"/>
           <w:lang w:val="es-ES"/>
         </w:rPr>
-        <w:t>5</w:t>
+        <w:t>3</w:t>
       </w:r>
       <w:r>
         <w:rPr>
@@ -6252,312 +5631,18 @@
         <w:pStyle w:val="Ttulo2"/>
         <w:rPr>
           <w:rFonts w:ascii="Arial" w:hAnsi="Arial" w:cs="Arial"/>
-          <w:b/>
-          <w:bCs/>
-          <w:color w:val="auto"/>
-          <w:sz w:val="22"/>
-          <w:szCs w:val="22"/>
-          <w:lang w:val="es-ES"/>
-        </w:rPr>
-      </w:pPr>
-      <w:r>
-        <w:rPr>
-          <w:rFonts w:ascii="Arial" w:hAnsi="Arial" w:cs="Arial"/>
-          <w:b/>
-          <w:bCs/>
-          <w:color w:val="auto"/>
-          <w:sz w:val="22"/>
-          <w:szCs w:val="22"/>
-          <w:lang w:val="es-ES"/>
-        </w:rPr>
-        <w:t>6</w:t>
-      </w:r>
-      <w:r>
-        <w:rPr>
-          <w:rFonts w:ascii="Arial" w:hAnsi="Arial" w:cs="Arial"/>
-          <w:b/>
-          <w:bCs/>
-          <w:color w:val="auto"/>
-          <w:sz w:val="22"/>
-          <w:szCs w:val="22"/>
-          <w:lang w:val="es-ES"/>
-        </w:rPr>
-        <w:t>. Planificación de la convocatoria comunitaria</w:t>
-      </w:r>
-    </w:p>
-    <w:p>
-      <w:pPr>
-        <w:jc w:val="both"/>
-        <w:rPr>
-          <w:rFonts w:ascii="Arial" w:hAnsi="Arial" w:cs="Arial"/>
-          <w:sz w:val="22"/>
-          <w:szCs w:val="22"/>
-          <w:lang w:val="es-ES"/>
-        </w:rPr>
-      </w:pPr>
-      <w:r>
-        <w:rPr>
-          <w:rFonts w:ascii="Arial" w:hAnsi="Arial" w:cs="Arial"/>
-          <w:b/>
-          <w:bCs/>
-          <w:sz w:val="22"/>
-          <w:szCs w:val="22"/>
-          <w:lang w:val="es-ES"/>
-        </w:rPr>
-        <w:t>Acción:</w:t>
-      </w:r>
-      <w:r>
-        <w:rPr>
-          <w:rFonts w:ascii="Arial" w:hAnsi="Arial" w:cs="Arial"/>
-          <w:sz w:val="22"/>
-          <w:szCs w:val="22"/>
-          <w:lang w:val="es-ES"/>
-        </w:rPr>
-        <w:t xml:space="preserve"> Una vez establecido el vínculo con el liderazgo y definido el propósito del trabajo conjunto, la filial debe planificar de manera explícita cómo se convocará a los miembros de la comunidad para las actividades del proyecto. En el área de GRD, una convocatoria sostenida de entre 15 y 30 personas debe considerarse un resultado exitoso; partir de expectativas más altas puede llevar a evaluaciones de fracaso que no reflejan la realidad del trabajo comunitario en este campo.</w:t>
-      </w:r>
-    </w:p>
-    <w:p>
-      <w:pPr>
-        <w:jc w:val="both"/>
-        <w:rPr>
-          <w:rFonts w:ascii="Arial" w:hAnsi="Arial" w:cs="Arial"/>
-          <w:sz w:val="22"/>
-          <w:szCs w:val="22"/>
-          <w:lang w:val="es-ES"/>
-        </w:rPr>
-      </w:pPr>
-      <w:r>
-        <w:rPr>
-          <w:rFonts w:ascii="Arial" w:hAnsi="Arial" w:cs="Arial"/>
-          <w:b/>
-          <w:bCs/>
-          <w:sz w:val="22"/>
-          <w:szCs w:val="22"/>
-          <w:lang w:val="es-ES"/>
-        </w:rPr>
-        <w:t>Punto crítico:</w:t>
-      </w:r>
-      <w:r>
-        <w:rPr>
-          <w:rFonts w:ascii="Arial" w:hAnsi="Arial" w:cs="Arial"/>
-          <w:sz w:val="22"/>
-          <w:szCs w:val="22"/>
-          <w:lang w:val="es-ES"/>
-        </w:rPr>
-        <w:t xml:space="preserve"> Delegar la convocatoria exclusivamente en el liderazgo comunitario es la estrategia más común, pero también la más frágil: los líderes convocan a quienes conocen, lo que puede excluir sectores de la comunidad y generar una participación desequilibrada. Además, los contextos políticos locales, la superposición de actividades y las múltiples demandas sobre el tiempo de los habitantes reducen la participación de manera impredecible.</w:t>
-      </w:r>
-    </w:p>
-    <w:p>
-      <w:pPr>
-        <w:jc w:val="both"/>
-        <w:rPr>
-          <w:rFonts w:ascii="Arial" w:hAnsi="Arial" w:cs="Arial"/>
-          <w:sz w:val="22"/>
-          <w:szCs w:val="22"/>
-          <w:lang w:val="es-ES"/>
-        </w:rPr>
-      </w:pPr>
-      <w:r>
-        <w:rPr>
-          <w:rFonts w:ascii="Arial" w:hAnsi="Arial" w:cs="Arial"/>
-          <w:b/>
-          <w:bCs/>
-          <w:sz w:val="22"/>
-          <w:szCs w:val="22"/>
-          <w:lang w:val="es-ES"/>
-        </w:rPr>
-        <w:t>Estrategias alternativas de convocatoria:</w:t>
-      </w:r>
-    </w:p>
-    <w:p>
-      <w:pPr>
-        <w:numPr>
-          <w:ilvl w:val="0"/>
-          <w:numId w:val="29"/>
-        </w:numPr>
-        <w:jc w:val="both"/>
-        <w:rPr>
-          <w:rFonts w:ascii="Arial" w:hAnsi="Arial" w:cs="Arial"/>
-          <w:sz w:val="22"/>
-          <w:szCs w:val="22"/>
-          <w:lang w:val="es-ES"/>
-        </w:rPr>
-      </w:pPr>
-      <w:r>
-        <w:rPr>
-          <w:rFonts w:ascii="Arial" w:hAnsi="Arial" w:cs="Arial"/>
-          <w:b/>
-          <w:bCs/>
-          <w:sz w:val="22"/>
-          <w:szCs w:val="22"/>
-          <w:lang w:val="es-ES"/>
-        </w:rPr>
-        <w:t>Integración programática:</w:t>
-      </w:r>
-      <w:r>
-        <w:rPr>
-          <w:rFonts w:ascii="Arial" w:hAnsi="Arial" w:cs="Arial"/>
-          <w:sz w:val="22"/>
-          <w:szCs w:val="22"/>
-          <w:lang w:val="es-ES"/>
-        </w:rPr>
-        <w:t xml:space="preserve"> Coordinar con otras áreas o programas de la filial que ya tengan presencia en la comunidad para incorporar las actividades dentro de espacios ya establecidos (ej. inducciones en salas de espera de centros de salud, actividades articuladas con equipos de salud o socorro).</w:t>
-      </w:r>
-    </w:p>
-    <w:p>
-      <w:pPr>
-        <w:numPr>
-          <w:ilvl w:val="0"/>
-          <w:numId w:val="29"/>
-        </w:numPr>
-        <w:jc w:val="both"/>
-        <w:rPr>
-          <w:rFonts w:ascii="Arial" w:hAnsi="Arial" w:cs="Arial"/>
-          <w:sz w:val="22"/>
-          <w:szCs w:val="22"/>
-          <w:lang w:val="es-ES"/>
-        </w:rPr>
-      </w:pPr>
-      <w:r>
-        <w:rPr>
-          <w:rFonts w:ascii="Arial" w:hAnsi="Arial" w:cs="Arial"/>
-          <w:b/>
-          <w:bCs/>
-          <w:sz w:val="22"/>
-          <w:szCs w:val="22"/>
-          <w:lang w:val="es-ES"/>
-        </w:rPr>
-        <w:lastRenderedPageBreak/>
-        <w:t>Redes secundarias:</w:t>
-      </w:r>
-      <w:r>
-        <w:rPr>
-          <w:rFonts w:ascii="Arial" w:hAnsi="Arial" w:cs="Arial"/>
-          <w:sz w:val="22"/>
-          <w:szCs w:val="22"/>
-          <w:lang w:val="es-ES"/>
-        </w:rPr>
-        <w:t xml:space="preserve"> Identificar, junto al liderazgo, personas con capacidad de convocatoria en sectores específicos que no dependen del líder principal: promotores de salud, docentes, líderes religiosos, representantes de grupos de jóvenes o adultos mayores.</w:t>
-      </w:r>
-    </w:p>
-    <w:p>
-      <w:pPr>
-        <w:numPr>
-          <w:ilvl w:val="0"/>
-          <w:numId w:val="29"/>
-        </w:numPr>
-        <w:jc w:val="both"/>
-        <w:rPr>
-          <w:rFonts w:ascii="Arial" w:hAnsi="Arial" w:cs="Arial"/>
-          <w:sz w:val="22"/>
-          <w:szCs w:val="22"/>
-          <w:lang w:val="es-ES"/>
-        </w:rPr>
-      </w:pPr>
-      <w:r>
-        <w:rPr>
-          <w:rFonts w:ascii="Arial" w:hAnsi="Arial" w:cs="Arial"/>
-          <w:b/>
-          <w:bCs/>
-          <w:sz w:val="22"/>
-          <w:szCs w:val="22"/>
-          <w:lang w:val="es-ES"/>
-        </w:rPr>
-        <w:t>Momentos y espacios de alta concurrencia:</w:t>
-      </w:r>
-      <w:r>
-        <w:rPr>
-          <w:rFonts w:ascii="Arial" w:hAnsi="Arial" w:cs="Arial"/>
-          <w:sz w:val="22"/>
-          <w:szCs w:val="22"/>
-          <w:lang w:val="es-ES"/>
-        </w:rPr>
-        <w:t xml:space="preserve"> Planificar actividades en horarios y lugares donde la comunidad ya se congrega de forma natural, reduciendo la barrera de asistencia.</w:t>
-      </w:r>
-    </w:p>
-    <w:p>
-      <w:pPr>
-        <w:numPr>
-          <w:ilvl w:val="0"/>
-          <w:numId w:val="29"/>
-        </w:numPr>
-        <w:jc w:val="both"/>
-        <w:rPr>
-          <w:rFonts w:ascii="Arial" w:hAnsi="Arial" w:cs="Arial"/>
-          <w:sz w:val="22"/>
-          <w:szCs w:val="22"/>
-          <w:lang w:val="es-ES"/>
-        </w:rPr>
-      </w:pPr>
-      <w:r>
-        <w:rPr>
-          <w:rFonts w:ascii="Arial" w:hAnsi="Arial" w:cs="Arial"/>
-          <w:b/>
-          <w:bCs/>
-          <w:sz w:val="22"/>
-          <w:szCs w:val="22"/>
-          <w:lang w:val="es-ES"/>
-        </w:rPr>
-        <w:t>Atractivo del proyecto:</w:t>
-      </w:r>
-      <w:r>
-        <w:rPr>
-          <w:rFonts w:ascii="Arial" w:hAnsi="Arial" w:cs="Arial"/>
-          <w:sz w:val="22"/>
-          <w:szCs w:val="22"/>
-          <w:lang w:val="es-ES"/>
-        </w:rPr>
-        <w:t xml:space="preserve"> Asegurarse de que la primera actividad ofrezca un valor tangible e inmediato para los participantes, de modo que la experiencia genere motivación para futuras convocatorias.</w:t>
-      </w:r>
-    </w:p>
-    <w:p>
-      <w:pPr>
-        <w:jc w:val="both"/>
-        <w:rPr>
-          <w:rFonts w:ascii="Arial" w:hAnsi="Arial" w:cs="Arial"/>
-          <w:sz w:val="22"/>
-          <w:szCs w:val="22"/>
-          <w:lang w:val="es-ES"/>
-        </w:rPr>
-      </w:pPr>
-      <w:r>
-        <w:rPr>
-          <w:rFonts w:ascii="Arial" w:hAnsi="Arial" w:cs="Arial"/>
-          <w:b/>
-          <w:bCs/>
-          <w:sz w:val="22"/>
-          <w:szCs w:val="22"/>
-          <w:lang w:val="es-ES"/>
-        </w:rPr>
-        <w:t>Estrategia de campo:</w:t>
-      </w:r>
-      <w:r>
-        <w:rPr>
-          <w:rFonts w:ascii="Arial" w:hAnsi="Arial" w:cs="Arial"/>
-          <w:sz w:val="22"/>
-          <w:szCs w:val="22"/>
-          <w:lang w:val="es-ES"/>
-        </w:rPr>
-        <w:t xml:space="preserve"> Si la participación cae por debajo del umbral mínimo acordado en dos o más actividades consecutivas, la filial debe evaluar si el problema es de convocatoria —resoluble con las estrategias anteriores— o si indica una limitación estructural de la comunidad como sitio de intervención. Esta evaluación debe documentarse antes de continuar.</w:t>
-      </w:r>
-    </w:p>
-    <w:p>
-      <w:pPr>
-        <w:pStyle w:val="Ttulo2"/>
-        <w:rPr>
-          <w:rFonts w:ascii="Arial" w:hAnsi="Arial" w:cs="Arial"/>
-          <w:sz w:val="22"/>
-          <w:szCs w:val="22"/>
-        </w:rPr>
-      </w:pPr>
-      <w:r>
-        <w:rPr>
-          <w:rFonts w:ascii="Arial" w:hAnsi="Arial" w:cs="Arial"/>
-          <w:b/>
-          <w:sz w:val="22"/>
-          <w:szCs w:val="22"/>
-        </w:rPr>
-        <w:t>7. Aplicación obligatoria del Cuestionario de Evaluación Rápida en Comunidades</w:t>
+          <w:sz w:val="22"/>
+          <w:szCs w:val="22"/>
+        </w:rPr>
+      </w:pPr>
+      <w:r>
+        <w:rPr>
+          <w:rFonts w:ascii="Arial" w:hAnsi="Arial" w:cs="Arial"/>
+          <w:b/>
+          <w:sz w:val="22"/>
+          <w:szCs w:val="22"/>
+        </w:rPr>
+        <w:t>4. Aplicación obligatoria del Cuestionario de Evaluación Rápida en Comunidades</w:t>
       </w:r>
     </w:p>
     <w:p>
@@ -6757,8 +5842,301 @@
           <w:szCs w:val="22"/>
           <w:lang w:val="es-ES"/>
         </w:rPr>
+        <w:t>5</w:t>
+      </w:r>
+      <w:r>
+        <w:rPr>
+          <w:rFonts w:ascii="Arial" w:hAnsi="Arial" w:cs="Arial"/>
+          <w:b/>
+          <w:bCs/>
+          <w:color w:val="auto"/>
+          <w:sz w:val="22"/>
+          <w:szCs w:val="22"/>
+          <w:lang w:val="es-ES"/>
+        </w:rPr>
+        <w:t>. Planificación de la convocatoria comunitaria</w:t>
+      </w:r>
+    </w:p>
+    <w:p>
+      <w:pPr>
+        <w:jc w:val="both"/>
+        <w:rPr>
+          <w:rFonts w:ascii="Arial" w:hAnsi="Arial" w:cs="Arial"/>
+          <w:sz w:val="22"/>
+          <w:szCs w:val="22"/>
+          <w:lang w:val="es-ES"/>
+        </w:rPr>
+      </w:pPr>
+      <w:r>
+        <w:rPr>
+          <w:rFonts w:ascii="Arial" w:hAnsi="Arial" w:cs="Arial"/>
+          <w:b/>
+          <w:bCs/>
+          <w:sz w:val="22"/>
+          <w:szCs w:val="22"/>
+          <w:lang w:val="es-ES"/>
+        </w:rPr>
+        <w:t>Acción:</w:t>
+      </w:r>
+      <w:r>
+        <w:rPr>
+          <w:rFonts w:ascii="Arial" w:hAnsi="Arial" w:cs="Arial"/>
+          <w:sz w:val="22"/>
+          <w:szCs w:val="22"/>
+          <w:lang w:val="es-ES"/>
+        </w:rPr>
+        <w:t xml:space="preserve"> Una vez establecido el vínculo con el liderazgo y definido el propósito del trabajo conjunto, la filial debe planificar de manera explícita cómo se convocará a los miembros de la comunidad para las actividades del proyecto. En el área de GRD, una convocatoria sostenida de entre 15 y 30 personas debe considerarse un resultado exitoso; partir de expectativas más altas puede llevar a evaluaciones de fracaso que no reflejan la realidad del trabajo comunitario en este campo.</w:t>
+      </w:r>
+    </w:p>
+    <w:p>
+      <w:pPr>
+        <w:jc w:val="both"/>
+        <w:rPr>
+          <w:rFonts w:ascii="Arial" w:hAnsi="Arial" w:cs="Arial"/>
+          <w:sz w:val="22"/>
+          <w:szCs w:val="22"/>
+          <w:lang w:val="es-ES"/>
+        </w:rPr>
+      </w:pPr>
+      <w:r>
+        <w:rPr>
+          <w:rFonts w:ascii="Arial" w:hAnsi="Arial" w:cs="Arial"/>
+          <w:b/>
+          <w:bCs/>
+          <w:sz w:val="22"/>
+          <w:szCs w:val="22"/>
+          <w:lang w:val="es-ES"/>
+        </w:rPr>
+        <w:t>Punto crítico:</w:t>
+      </w:r>
+      <w:r>
+        <w:rPr>
+          <w:rFonts w:ascii="Arial" w:hAnsi="Arial" w:cs="Arial"/>
+          <w:sz w:val="22"/>
+          <w:szCs w:val="22"/>
+          <w:lang w:val="es-ES"/>
+        </w:rPr>
+        <w:t xml:space="preserve"> Delegar la convocatoria exclusivamente en el liderazgo comunitario es la estrategia más común, pero también la más frágil: los líderes convocan a quienes conocen, lo que puede excluir sectores de la comunidad y generar una participación desequilibrada. Además, los contextos políticos locales, la superposición de actividades y las múltiples demandas sobre el tiempo de los habitantes reducen la participación de manera impredecible.</w:t>
+      </w:r>
+    </w:p>
+    <w:p>
+      <w:pPr>
+        <w:jc w:val="both"/>
+        <w:rPr>
+          <w:rFonts w:ascii="Arial" w:hAnsi="Arial" w:cs="Arial"/>
+          <w:sz w:val="22"/>
+          <w:szCs w:val="22"/>
+          <w:lang w:val="es-ES"/>
+        </w:rPr>
+      </w:pPr>
+      <w:r>
+        <w:rPr>
+          <w:rFonts w:ascii="Arial" w:hAnsi="Arial" w:cs="Arial"/>
+          <w:b/>
+          <w:bCs/>
+          <w:sz w:val="22"/>
+          <w:szCs w:val="22"/>
+          <w:lang w:val="es-ES"/>
+        </w:rPr>
+        <w:t>Estrategias alternativas de convocatoria:</w:t>
+      </w:r>
+    </w:p>
+    <w:p>
+      <w:pPr>
+        <w:numPr>
+          <w:ilvl w:val="0"/>
+          <w:numId w:val="29"/>
+        </w:numPr>
+        <w:jc w:val="both"/>
+        <w:rPr>
+          <w:rFonts w:ascii="Arial" w:hAnsi="Arial" w:cs="Arial"/>
+          <w:sz w:val="22"/>
+          <w:szCs w:val="22"/>
+          <w:lang w:val="es-ES"/>
+        </w:rPr>
+      </w:pPr>
+      <w:r>
+        <w:rPr>
+          <w:rFonts w:ascii="Arial" w:hAnsi="Arial" w:cs="Arial"/>
+          <w:b/>
+          <w:bCs/>
+          <w:sz w:val="22"/>
+          <w:szCs w:val="22"/>
+          <w:lang w:val="es-ES"/>
+        </w:rPr>
+        <w:t>Integración programática:</w:t>
+      </w:r>
+      <w:r>
+        <w:rPr>
+          <w:rFonts w:ascii="Arial" w:hAnsi="Arial" w:cs="Arial"/>
+          <w:sz w:val="22"/>
+          <w:szCs w:val="22"/>
+          <w:lang w:val="es-ES"/>
+        </w:rPr>
+        <w:t xml:space="preserve"> Coordinar con otras áreas o programas de la filial que ya tengan presencia en la comunidad para incorporar las actividades dentro de espacios ya establecidos (ej. inducciones en salas de espera de centros de salud, actividades articuladas con equipos de salud o socorro).</w:t>
+      </w:r>
+    </w:p>
+    <w:p>
+      <w:pPr>
+        <w:numPr>
+          <w:ilvl w:val="0"/>
+          <w:numId w:val="29"/>
+        </w:numPr>
+        <w:jc w:val="both"/>
+        <w:rPr>
+          <w:rFonts w:ascii="Arial" w:hAnsi="Arial" w:cs="Arial"/>
+          <w:sz w:val="22"/>
+          <w:szCs w:val="22"/>
+          <w:lang w:val="es-ES"/>
+        </w:rPr>
+      </w:pPr>
+      <w:r>
+        <w:rPr>
+          <w:rFonts w:ascii="Arial" w:hAnsi="Arial" w:cs="Arial"/>
+          <w:b/>
+          <w:bCs/>
+          <w:sz w:val="22"/>
+          <w:szCs w:val="22"/>
+          <w:lang w:val="es-ES"/>
+        </w:rPr>
         <w:lastRenderedPageBreak/>
-        <w:t>8</w:t>
+        <w:t>Redes secundarias:</w:t>
+      </w:r>
+      <w:r>
+        <w:rPr>
+          <w:rFonts w:ascii="Arial" w:hAnsi="Arial" w:cs="Arial"/>
+          <w:sz w:val="22"/>
+          <w:szCs w:val="22"/>
+          <w:lang w:val="es-ES"/>
+        </w:rPr>
+        <w:t xml:space="preserve"> Identificar, junto al liderazgo, personas con capacidad de convocatoria en sectores específicos que no dependen del líder principal: promotores de salud, docentes, líderes religiosos, representantes de grupos de jóvenes o adultos mayores.</w:t>
+      </w:r>
+    </w:p>
+    <w:p>
+      <w:pPr>
+        <w:numPr>
+          <w:ilvl w:val="0"/>
+          <w:numId w:val="29"/>
+        </w:numPr>
+        <w:jc w:val="both"/>
+        <w:rPr>
+          <w:rFonts w:ascii="Arial" w:hAnsi="Arial" w:cs="Arial"/>
+          <w:sz w:val="22"/>
+          <w:szCs w:val="22"/>
+          <w:lang w:val="es-ES"/>
+        </w:rPr>
+      </w:pPr>
+      <w:r>
+        <w:rPr>
+          <w:rFonts w:ascii="Arial" w:hAnsi="Arial" w:cs="Arial"/>
+          <w:b/>
+          <w:bCs/>
+          <w:sz w:val="22"/>
+          <w:szCs w:val="22"/>
+          <w:lang w:val="es-ES"/>
+        </w:rPr>
+        <w:t>Momentos y espacios de alta concurrencia:</w:t>
+      </w:r>
+      <w:r>
+        <w:rPr>
+          <w:rFonts w:ascii="Arial" w:hAnsi="Arial" w:cs="Arial"/>
+          <w:sz w:val="22"/>
+          <w:szCs w:val="22"/>
+          <w:lang w:val="es-ES"/>
+        </w:rPr>
+        <w:t xml:space="preserve"> Planificar actividades en horarios y lugares donde la comunidad ya se congrega de forma natural, reduciendo la barrera de asistencia.</w:t>
+      </w:r>
+    </w:p>
+    <w:p>
+      <w:pPr>
+        <w:numPr>
+          <w:ilvl w:val="0"/>
+          <w:numId w:val="29"/>
+        </w:numPr>
+        <w:jc w:val="both"/>
+        <w:rPr>
+          <w:rFonts w:ascii="Arial" w:hAnsi="Arial" w:cs="Arial"/>
+          <w:sz w:val="22"/>
+          <w:szCs w:val="22"/>
+          <w:lang w:val="es-ES"/>
+        </w:rPr>
+      </w:pPr>
+      <w:r>
+        <w:rPr>
+          <w:rFonts w:ascii="Arial" w:hAnsi="Arial" w:cs="Arial"/>
+          <w:b/>
+          <w:bCs/>
+          <w:sz w:val="22"/>
+          <w:szCs w:val="22"/>
+          <w:lang w:val="es-ES"/>
+        </w:rPr>
+        <w:t>Atractivo del proyecto:</w:t>
+      </w:r>
+      <w:r>
+        <w:rPr>
+          <w:rFonts w:ascii="Arial" w:hAnsi="Arial" w:cs="Arial"/>
+          <w:sz w:val="22"/>
+          <w:szCs w:val="22"/>
+          <w:lang w:val="es-ES"/>
+        </w:rPr>
+        <w:t xml:space="preserve"> Asegurarse de que la primera actividad ofrezca un valor tangible e inmediato para los participantes, de modo que la experiencia genere motivación para futuras convocatorias.</w:t>
+      </w:r>
+    </w:p>
+    <w:p>
+      <w:pPr>
+        <w:jc w:val="both"/>
+        <w:rPr>
+          <w:rFonts w:ascii="Arial" w:hAnsi="Arial" w:cs="Arial"/>
+          <w:sz w:val="22"/>
+          <w:szCs w:val="22"/>
+          <w:lang w:val="es-ES"/>
+        </w:rPr>
+      </w:pPr>
+      <w:r>
+        <w:rPr>
+          <w:rFonts w:ascii="Arial" w:hAnsi="Arial" w:cs="Arial"/>
+          <w:b/>
+          <w:bCs/>
+          <w:sz w:val="22"/>
+          <w:szCs w:val="22"/>
+          <w:lang w:val="es-ES"/>
+        </w:rPr>
+        <w:t>Estrategia de campo:</w:t>
+      </w:r>
+      <w:r>
+        <w:rPr>
+          <w:rFonts w:ascii="Arial" w:hAnsi="Arial" w:cs="Arial"/>
+          <w:sz w:val="22"/>
+          <w:szCs w:val="22"/>
+          <w:lang w:val="es-ES"/>
+        </w:rPr>
+        <w:t xml:space="preserve"> Si la participación cae por debajo del umbral mínimo acordado en dos o más actividades consecutivas, la filial debe evaluar si el problema es de convocatoria —resoluble con las estrategias anteriores— o si indica una limitación estructural de la comunidad como sitio de intervención. Esta evaluación debe documentarse antes de continuar.</w:t>
+      </w:r>
+    </w:p>
+    <w:p>
+      <w:pPr>
+        <w:pStyle w:val="Ttulo2"/>
+        <w:rPr>
+          <w:rFonts w:ascii="Arial" w:hAnsi="Arial" w:cs="Arial"/>
+          <w:b/>
+          <w:bCs/>
+          <w:color w:val="auto"/>
+          <w:sz w:val="22"/>
+          <w:szCs w:val="22"/>
+          <w:lang w:val="es-ES"/>
+        </w:rPr>
+      </w:pPr>
+      <w:r>
+        <w:rPr>
+          <w:rFonts w:ascii="Arial" w:hAnsi="Arial" w:cs="Arial"/>
+          <w:b/>
+          <w:bCs/>
+          <w:color w:val="auto"/>
+          <w:sz w:val="22"/>
+          <w:szCs w:val="22"/>
+          <w:lang w:val="es-ES"/>
+        </w:rPr>
+        <w:t>6</w:t>
       </w:r>
       <w:r>
         <w:rPr>
@@ -8010,21 +7388,642 @@
           <w:rFonts w:ascii="Arial" w:hAnsi="Arial" w:cs="Arial"/>
           <w:b/>
           <w:bCs/>
-          <w:sz w:val="22"/>
-          <w:szCs w:val="22"/>
-        </w:rPr>
-      </w:pPr>
-      <w:r>
-        <w:rPr>
-          <w:rFonts w:ascii="Arial" w:hAnsi="Arial" w:cs="Arial"/>
-          <w:b/>
-          <w:bCs/>
           <w:color w:val="auto"/>
           <w:sz w:val="22"/>
           <w:szCs w:val="22"/>
           <w:lang w:val="es-ES"/>
         </w:rPr>
-        <w:t>2</w:t>
+      </w:pPr>
+      <w:r>
+        <w:rPr>
+          <w:rFonts w:ascii="Arial" w:hAnsi="Arial" w:cs="Arial"/>
+          <w:b/>
+          <w:bCs/>
+          <w:color w:val="auto"/>
+          <w:sz w:val="22"/>
+          <w:szCs w:val="22"/>
+          <w:lang w:val="es-ES"/>
+        </w:rPr>
+        <w:t xml:space="preserve">2. </w:t>
+      </w:r>
+      <w:r>
+        <w:rPr>
+          <w:rFonts w:ascii="Arial" w:hAnsi="Arial" w:cs="Arial"/>
+          <w:b/>
+          <w:bCs/>
+          <w:color w:val="auto"/>
+          <w:sz w:val="22"/>
+          <w:szCs w:val="22"/>
+          <w:lang w:val="es-ES"/>
+        </w:rPr>
+        <w:t>Mapeo de gobernanza</w:t>
+      </w:r>
+      <w:r>
+        <w:rPr>
+          <w:rFonts w:ascii="Arial" w:hAnsi="Arial" w:cs="Arial"/>
+          <w:b/>
+          <w:bCs/>
+          <w:color w:val="auto"/>
+          <w:sz w:val="22"/>
+          <w:szCs w:val="22"/>
+          <w:lang w:val="es-ES"/>
+        </w:rPr>
+        <w:t>, relaciones económicas</w:t>
+      </w:r>
+      <w:r>
+        <w:rPr>
+          <w:rFonts w:ascii="Arial" w:hAnsi="Arial" w:cs="Arial"/>
+          <w:b/>
+          <w:bCs/>
+          <w:color w:val="auto"/>
+          <w:sz w:val="22"/>
+          <w:szCs w:val="22"/>
+          <w:lang w:val="es-ES"/>
+        </w:rPr>
+        <w:t xml:space="preserve"> y poder real</w:t>
+      </w:r>
+    </w:p>
+    <w:p>
+      <w:pPr>
+        <w:numPr>
+          <w:ilvl w:val="0"/>
+          <w:numId w:val="6"/>
+        </w:numPr>
+        <w:jc w:val="both"/>
+        <w:rPr>
+          <w:rFonts w:ascii="Arial" w:hAnsi="Arial" w:cs="Arial"/>
+          <w:sz w:val="22"/>
+          <w:szCs w:val="22"/>
+          <w:lang w:val="es-ES"/>
+        </w:rPr>
+      </w:pPr>
+      <w:r>
+        <w:rPr>
+          <w:rFonts w:ascii="Arial" w:hAnsi="Arial" w:cs="Arial"/>
+          <w:b/>
+          <w:bCs/>
+          <w:sz w:val="22"/>
+          <w:szCs w:val="22"/>
+          <w:lang w:val="es-ES"/>
+        </w:rPr>
+        <w:t>Acción:</w:t>
+      </w:r>
+      <w:r>
+        <w:rPr>
+          <w:rFonts w:ascii="Arial" w:hAnsi="Arial" w:cs="Arial"/>
+          <w:sz w:val="22"/>
+          <w:szCs w:val="22"/>
+          <w:lang w:val="es-ES"/>
+        </w:rPr>
+        <w:t xml:space="preserve"> </w:t>
+      </w:r>
+      <w:r>
+        <w:rPr>
+          <w:rFonts w:ascii="Arial" w:hAnsi="Arial" w:cs="Arial"/>
+          <w:sz w:val="22"/>
+          <w:szCs w:val="22"/>
+        </w:rPr>
+        <w:t>Registrar</w:t>
+      </w:r>
+      <w:r>
+        <w:rPr>
+          <w:rFonts w:ascii="Arial" w:hAnsi="Arial" w:cs="Arial"/>
+          <w:sz w:val="22"/>
+          <w:szCs w:val="22"/>
+        </w:rPr>
+        <w:t xml:space="preserve"> cómo se toman las decisiones (consensos, asambleas o jerarquías)</w:t>
+      </w:r>
+      <w:r>
+        <w:rPr>
+          <w:rFonts w:ascii="Arial" w:hAnsi="Arial" w:cs="Arial"/>
+          <w:sz w:val="22"/>
+          <w:szCs w:val="22"/>
+        </w:rPr>
+        <w:t xml:space="preserve">, </w:t>
+      </w:r>
+      <w:r>
+        <w:rPr>
+          <w:rFonts w:ascii="Arial" w:hAnsi="Arial" w:cs="Arial"/>
+          <w:sz w:val="22"/>
+          <w:szCs w:val="22"/>
+        </w:rPr>
+        <w:t xml:space="preserve">qué redes de intercambio </w:t>
+      </w:r>
+      <w:r>
+        <w:rPr>
+          <w:rFonts w:ascii="Arial" w:hAnsi="Arial" w:cs="Arial"/>
+          <w:sz w:val="22"/>
+          <w:szCs w:val="22"/>
+        </w:rPr>
+        <w:t xml:space="preserve">existen </w:t>
+      </w:r>
+      <w:r>
+        <w:rPr>
+          <w:rFonts w:ascii="Arial" w:hAnsi="Arial" w:cs="Arial"/>
+          <w:sz w:val="22"/>
+          <w:szCs w:val="22"/>
+        </w:rPr>
+        <w:t xml:space="preserve">y si las mismas están basadas en lazos </w:t>
+      </w:r>
+      <w:r>
+        <w:rPr>
+          <w:rFonts w:ascii="Arial" w:hAnsi="Arial" w:cs="Arial"/>
+          <w:sz w:val="22"/>
+          <w:szCs w:val="22"/>
+        </w:rPr>
+        <w:t xml:space="preserve">familiares </w:t>
+      </w:r>
+      <w:r>
+        <w:rPr>
+          <w:rFonts w:ascii="Arial" w:hAnsi="Arial" w:cs="Arial"/>
+          <w:sz w:val="22"/>
+          <w:szCs w:val="22"/>
+        </w:rPr>
+        <w:t>extendidos, vecinales</w:t>
+      </w:r>
+      <w:r>
+        <w:rPr>
+          <w:rFonts w:ascii="Arial" w:hAnsi="Arial" w:cs="Arial"/>
+          <w:sz w:val="22"/>
+          <w:szCs w:val="22"/>
+        </w:rPr>
+        <w:t>,</w:t>
+      </w:r>
+      <w:r>
+        <w:rPr>
+          <w:rFonts w:ascii="Arial" w:hAnsi="Arial" w:cs="Arial"/>
+          <w:sz w:val="22"/>
+          <w:szCs w:val="22"/>
+        </w:rPr>
+        <w:t xml:space="preserve"> </w:t>
+      </w:r>
+      <w:r>
+        <w:rPr>
+          <w:rFonts w:ascii="Arial" w:hAnsi="Arial" w:cs="Arial"/>
+          <w:sz w:val="22"/>
+          <w:szCs w:val="22"/>
+        </w:rPr>
+        <w:t>amistad</w:t>
+      </w:r>
+      <w:r>
+        <w:rPr>
+          <w:rFonts w:ascii="Arial" w:hAnsi="Arial" w:cs="Arial"/>
+          <w:sz w:val="22"/>
+          <w:szCs w:val="22"/>
+        </w:rPr>
+        <w:t xml:space="preserve"> o</w:t>
+      </w:r>
+      <w:r>
+        <w:rPr>
+          <w:rFonts w:ascii="Arial" w:hAnsi="Arial" w:cs="Arial"/>
+          <w:sz w:val="22"/>
+          <w:szCs w:val="22"/>
+        </w:rPr>
+        <w:t xml:space="preserve"> burocracia del Estado</w:t>
+      </w:r>
+      <w:r>
+        <w:rPr>
+          <w:rFonts w:ascii="Arial" w:hAnsi="Arial" w:cs="Arial"/>
+          <w:sz w:val="22"/>
+          <w:szCs w:val="22"/>
+        </w:rPr>
+        <w:t xml:space="preserve">. </w:t>
+      </w:r>
+    </w:p>
+    <w:p>
+      <w:pPr>
+        <w:numPr>
+          <w:ilvl w:val="0"/>
+          <w:numId w:val="6"/>
+        </w:numPr>
+        <w:jc w:val="both"/>
+        <w:rPr>
+          <w:rFonts w:ascii="Arial" w:hAnsi="Arial" w:cs="Arial"/>
+          <w:sz w:val="22"/>
+          <w:szCs w:val="22"/>
+        </w:rPr>
+      </w:pPr>
+      <w:r>
+        <w:rPr>
+          <w:rFonts w:ascii="Arial" w:hAnsi="Arial" w:cs="Arial"/>
+          <w:b/>
+          <w:bCs/>
+          <w:sz w:val="22"/>
+          <w:szCs w:val="22"/>
+        </w:rPr>
+        <w:t>Herramienta:</w:t>
+      </w:r>
+      <w:r>
+        <w:rPr>
+          <w:rFonts w:ascii="Arial" w:hAnsi="Arial" w:cs="Arial"/>
+          <w:sz w:val="22"/>
+          <w:szCs w:val="22"/>
+        </w:rPr>
+        <w:t xml:space="preserve"> </w:t>
+      </w:r>
+      <w:r>
+        <w:rPr>
+          <w:rFonts w:ascii="Arial" w:hAnsi="Arial" w:cs="Arial"/>
+          <w:sz w:val="22"/>
+          <w:szCs w:val="22"/>
+        </w:rPr>
+        <w:t xml:space="preserve">Sociograma de Redes de Influencia para mapear los flujos de poder y la autoridad moral dentro de la comunidad. </w:t>
+      </w:r>
+    </w:p>
+    <w:p>
+      <w:pPr>
+        <w:pStyle w:val="Ttulo2"/>
+        <w:rPr>
+          <w:rFonts w:ascii="Arial" w:hAnsi="Arial" w:cs="Arial"/>
+          <w:b/>
+          <w:bCs/>
+          <w:color w:val="auto"/>
+          <w:sz w:val="22"/>
+          <w:szCs w:val="22"/>
+          <w:lang w:val="es-ES"/>
+        </w:rPr>
+      </w:pPr>
+      <w:r>
+        <w:rPr>
+          <w:rFonts w:ascii="Arial" w:hAnsi="Arial" w:cs="Arial"/>
+          <w:b/>
+          <w:bCs/>
+          <w:color w:val="auto"/>
+          <w:sz w:val="22"/>
+          <w:szCs w:val="22"/>
+          <w:lang w:val="es-ES"/>
+        </w:rPr>
+        <w:t xml:space="preserve">3. </w:t>
+      </w:r>
+      <w:r>
+        <w:rPr>
+          <w:rFonts w:ascii="Arial" w:hAnsi="Arial" w:cs="Arial"/>
+          <w:b/>
+          <w:bCs/>
+          <w:color w:val="auto"/>
+          <w:sz w:val="22"/>
+          <w:szCs w:val="22"/>
+          <w:lang w:val="es-ES"/>
+        </w:rPr>
+        <w:t>Identificación y gestión de actores de poder informal</w:t>
+      </w:r>
+    </w:p>
+    <w:p>
+      <w:pPr>
+        <w:jc w:val="both"/>
+        <w:rPr>
+          <w:rFonts w:ascii="Arial" w:hAnsi="Arial" w:cs="Arial"/>
+          <w:sz w:val="22"/>
+          <w:szCs w:val="22"/>
+          <w:lang w:val="es-ES"/>
+        </w:rPr>
+      </w:pPr>
+      <w:r>
+        <w:rPr>
+          <w:rFonts w:ascii="Arial" w:hAnsi="Arial" w:cs="Arial"/>
+          <w:b/>
+          <w:bCs/>
+          <w:sz w:val="22"/>
+          <w:szCs w:val="22"/>
+          <w:lang w:val="es-ES"/>
+        </w:rPr>
+        <w:t>Acción:</w:t>
+      </w:r>
+      <w:r>
+        <w:rPr>
+          <w:rFonts w:ascii="Arial" w:hAnsi="Arial" w:cs="Arial"/>
+          <w:sz w:val="22"/>
+          <w:szCs w:val="22"/>
+          <w:lang w:val="es-ES"/>
+        </w:rPr>
+        <w:t> El mapeo de gobernanza permite identificar la estructura formal del liderazgo, pero en muchas comunidades existen actores de poder informal —grupos irregulares, líderes políticos sin cargo explícito, redes de control económico o territorial— que no aparecen en los mapeos previos y que pueden incidir directamente sobre la viabilidad del proyecto. La filial debe desarrollar sensibilidad para detectarlos desde la primera visita.</w:t>
+      </w:r>
+    </w:p>
+    <w:p>
+      <w:pPr>
+        <w:jc w:val="both"/>
+        <w:rPr>
+          <w:rFonts w:ascii="Arial" w:hAnsi="Arial" w:cs="Arial"/>
+          <w:b/>
+          <w:bCs/>
+          <w:sz w:val="22"/>
+          <w:szCs w:val="22"/>
+          <w:lang w:val="es-ES"/>
+        </w:rPr>
+      </w:pPr>
+      <w:r>
+        <w:rPr>
+          <w:rFonts w:ascii="Arial" w:hAnsi="Arial" w:cs="Arial"/>
+          <w:b/>
+          <w:bCs/>
+          <w:sz w:val="22"/>
+          <w:szCs w:val="22"/>
+          <w:lang w:val="es-ES"/>
+        </w:rPr>
+        <w:t>Señales de alerta:</w:t>
+      </w:r>
+    </w:p>
+    <w:p>
+      <w:pPr>
+        <w:numPr>
+          <w:ilvl w:val="0"/>
+          <w:numId w:val="33"/>
+        </w:numPr>
+        <w:jc w:val="both"/>
+        <w:rPr>
+          <w:rFonts w:ascii="Arial" w:hAnsi="Arial" w:cs="Arial"/>
+          <w:sz w:val="22"/>
+          <w:szCs w:val="22"/>
+          <w:lang w:val="es-ES"/>
+        </w:rPr>
+      </w:pPr>
+      <w:r>
+        <w:rPr>
+          <w:rFonts w:ascii="Arial" w:hAnsi="Arial" w:cs="Arial"/>
+          <w:sz w:val="22"/>
+          <w:szCs w:val="22"/>
+          <w:lang w:val="es-ES"/>
+        </w:rPr>
+        <w:lastRenderedPageBreak/>
+        <w:t>Personas sin cargo formal a quienes el liderazgo consulta o pide aprobación antes de tomar decisiones.</w:t>
+      </w:r>
+    </w:p>
+    <w:p>
+      <w:pPr>
+        <w:numPr>
+          <w:ilvl w:val="0"/>
+          <w:numId w:val="33"/>
+        </w:numPr>
+        <w:jc w:val="both"/>
+        <w:rPr>
+          <w:rFonts w:ascii="Arial" w:hAnsi="Arial" w:cs="Arial"/>
+          <w:sz w:val="22"/>
+          <w:szCs w:val="22"/>
+          <w:lang w:val="es-ES"/>
+        </w:rPr>
+      </w:pPr>
+      <w:r>
+        <w:rPr>
+          <w:rFonts w:ascii="Arial" w:hAnsi="Arial" w:cs="Arial"/>
+          <w:sz w:val="22"/>
+          <w:szCs w:val="22"/>
+          <w:lang w:val="es-ES"/>
+        </w:rPr>
+        <w:t>Referencias veladas a "permisos" o "acuerdos" que deben gestionarse fuera de los canales formales.</w:t>
+      </w:r>
+    </w:p>
+    <w:p>
+      <w:pPr>
+        <w:numPr>
+          <w:ilvl w:val="0"/>
+          <w:numId w:val="33"/>
+        </w:numPr>
+        <w:jc w:val="both"/>
+        <w:rPr>
+          <w:rFonts w:ascii="Arial" w:hAnsi="Arial" w:cs="Arial"/>
+          <w:sz w:val="22"/>
+          <w:szCs w:val="22"/>
+          <w:lang w:val="es-ES"/>
+        </w:rPr>
+      </w:pPr>
+      <w:r>
+        <w:rPr>
+          <w:rFonts w:ascii="Arial" w:hAnsi="Arial" w:cs="Arial"/>
+          <w:sz w:val="22"/>
+          <w:szCs w:val="22"/>
+          <w:lang w:val="es-ES"/>
+        </w:rPr>
+        <w:t>Cambios repentinos de actitud del liderazgo sin explicación aparente.</w:t>
+      </w:r>
+    </w:p>
+    <w:p>
+      <w:pPr>
+        <w:numPr>
+          <w:ilvl w:val="0"/>
+          <w:numId w:val="33"/>
+        </w:numPr>
+        <w:jc w:val="both"/>
+        <w:rPr>
+          <w:rFonts w:ascii="Arial" w:hAnsi="Arial" w:cs="Arial"/>
+          <w:sz w:val="22"/>
+          <w:szCs w:val="22"/>
+          <w:lang w:val="es-ES"/>
+        </w:rPr>
+      </w:pPr>
+      <w:r>
+        <w:rPr>
+          <w:rFonts w:ascii="Arial" w:hAnsi="Arial" w:cs="Arial"/>
+          <w:sz w:val="22"/>
+          <w:szCs w:val="22"/>
+          <w:lang w:val="es-ES"/>
+        </w:rPr>
+        <w:t>Restricciones espontáneas sobre ciertos espacios físicos, horarios o temas de conversación.</w:t>
+      </w:r>
+    </w:p>
+    <w:p>
+      <w:pPr>
+        <w:numPr>
+          <w:ilvl w:val="0"/>
+          <w:numId w:val="33"/>
+        </w:numPr>
+        <w:jc w:val="both"/>
+        <w:rPr>
+          <w:rFonts w:ascii="Arial" w:hAnsi="Arial" w:cs="Arial"/>
+          <w:sz w:val="22"/>
+          <w:szCs w:val="22"/>
+          <w:lang w:val="es-ES"/>
+        </w:rPr>
+      </w:pPr>
+      <w:r>
+        <w:rPr>
+          <w:rFonts w:ascii="Arial" w:hAnsi="Arial" w:cs="Arial"/>
+          <w:sz w:val="22"/>
+          <w:szCs w:val="22"/>
+          <w:lang w:val="es-ES"/>
+        </w:rPr>
+        <w:t>Presencia de personas no identificadas que observan las actividades sin participar.</w:t>
+      </w:r>
+    </w:p>
+    <w:p>
+      <w:pPr>
+        <w:jc w:val="both"/>
+        <w:rPr>
+          <w:rFonts w:ascii="Arial" w:hAnsi="Arial" w:cs="Arial"/>
+          <w:b/>
+          <w:bCs/>
+          <w:sz w:val="22"/>
+          <w:szCs w:val="22"/>
+          <w:lang w:val="es-ES"/>
+        </w:rPr>
+      </w:pPr>
+      <w:r>
+        <w:rPr>
+          <w:rFonts w:ascii="Arial" w:hAnsi="Arial" w:cs="Arial"/>
+          <w:b/>
+          <w:bCs/>
+          <w:sz w:val="22"/>
+          <w:szCs w:val="22"/>
+          <w:lang w:val="es-ES"/>
+        </w:rPr>
+        <w:t>Protocolo de neutralidad:</w:t>
+      </w:r>
+    </w:p>
+    <w:p>
+      <w:pPr>
+        <w:numPr>
+          <w:ilvl w:val="0"/>
+          <w:numId w:val="34"/>
+        </w:numPr>
+        <w:jc w:val="both"/>
+        <w:rPr>
+          <w:rFonts w:ascii="Arial" w:hAnsi="Arial" w:cs="Arial"/>
+          <w:sz w:val="22"/>
+          <w:szCs w:val="22"/>
+          <w:lang w:val="es-ES"/>
+        </w:rPr>
+      </w:pPr>
+      <w:r>
+        <w:rPr>
+          <w:rFonts w:ascii="Arial" w:hAnsi="Arial" w:cs="Arial"/>
+          <w:sz w:val="22"/>
+          <w:szCs w:val="22"/>
+          <w:lang w:val="es-ES"/>
+        </w:rPr>
+        <w:t>No tomar partido ni alinearse públicamente con ningún actor de poder —formal o informal— que tenga disputas internas dentro de la comunidad.</w:t>
+      </w:r>
+    </w:p>
+    <w:p>
+      <w:pPr>
+        <w:numPr>
+          <w:ilvl w:val="0"/>
+          <w:numId w:val="34"/>
+        </w:numPr>
+        <w:jc w:val="both"/>
+        <w:rPr>
+          <w:rFonts w:ascii="Arial" w:hAnsi="Arial" w:cs="Arial"/>
+          <w:sz w:val="22"/>
+          <w:szCs w:val="22"/>
+          <w:lang w:val="es-ES"/>
+        </w:rPr>
+      </w:pPr>
+      <w:r>
+        <w:rPr>
+          <w:rFonts w:ascii="Arial" w:hAnsi="Arial" w:cs="Arial"/>
+          <w:sz w:val="22"/>
+          <w:szCs w:val="22"/>
+          <w:lang w:val="es-ES"/>
+        </w:rPr>
+        <w:t>Evitar que el proyecto sea asociado con una facción política, económica o social específica.</w:t>
+      </w:r>
+    </w:p>
+    <w:p>
+      <w:pPr>
+        <w:numPr>
+          <w:ilvl w:val="0"/>
+          <w:numId w:val="34"/>
+        </w:numPr>
+        <w:jc w:val="both"/>
+        <w:rPr>
+          <w:rFonts w:ascii="Arial" w:hAnsi="Arial" w:cs="Arial"/>
+          <w:sz w:val="22"/>
+          <w:szCs w:val="22"/>
+          <w:lang w:val="es-ES"/>
+        </w:rPr>
+      </w:pPr>
+      <w:r>
+        <w:rPr>
+          <w:rFonts w:ascii="Arial" w:hAnsi="Arial" w:cs="Arial"/>
+          <w:sz w:val="22"/>
+          <w:szCs w:val="22"/>
+          <w:lang w:val="es-ES"/>
+        </w:rPr>
+        <w:t>Si un actor informal condiciona el acceso o la continuidad del proyecto, documentar el hecho internamente y escalar a la coordinación de la filial antes de tomar cualquier decisión.</w:t>
+      </w:r>
+    </w:p>
+    <w:p>
+      <w:pPr>
+        <w:jc w:val="both"/>
+        <w:rPr>
+          <w:rFonts w:ascii="Arial" w:hAnsi="Arial" w:cs="Arial"/>
+          <w:sz w:val="22"/>
+          <w:szCs w:val="22"/>
+          <w:lang w:val="es-ES"/>
+        </w:rPr>
+      </w:pPr>
+      <w:r>
+        <w:rPr>
+          <w:rFonts w:ascii="Arial" w:hAnsi="Arial" w:cs="Arial"/>
+          <w:b/>
+          <w:bCs/>
+          <w:sz w:val="22"/>
+          <w:szCs w:val="22"/>
+          <w:lang w:val="es-ES"/>
+        </w:rPr>
+        <w:t>Estrategia de campo:</w:t>
+      </w:r>
+      <w:r>
+        <w:rPr>
+          <w:rFonts w:ascii="Arial" w:hAnsi="Arial" w:cs="Arial"/>
+          <w:sz w:val="22"/>
+          <w:szCs w:val="22"/>
+          <w:lang w:val="es-ES"/>
+        </w:rPr>
+        <w:t> Ante la presencia de actores de poder informal, la postura de la filial es de observación activa y no confrontación. El objetivo es comprender su rol sin reconocerlo públicamente ni ceder ante condiciones que comprometan la neutralidad institucional o la seguridad del equipo.</w:t>
+      </w:r>
+    </w:p>
+    <w:p>
+      <w:pPr>
+        <w:jc w:val="both"/>
+        <w:rPr>
+          <w:rFonts w:ascii="Arial" w:hAnsi="Arial" w:cs="Arial"/>
+          <w:sz w:val="22"/>
+          <w:szCs w:val="22"/>
+          <w:lang w:val="es-ES"/>
+        </w:rPr>
+      </w:pPr>
+      <w:r>
+        <w:rPr>
+          <w:rFonts w:ascii="Arial" w:hAnsi="Arial" w:cs="Arial"/>
+          <w:b/>
+          <w:bCs/>
+          <w:sz w:val="22"/>
+          <w:szCs w:val="22"/>
+          <w:lang w:val="es-ES"/>
+        </w:rPr>
+        <w:t>Punto crítico:</w:t>
+      </w:r>
+      <w:r>
+        <w:rPr>
+          <w:rFonts w:ascii="Arial" w:hAnsi="Arial" w:cs="Arial"/>
+          <w:sz w:val="22"/>
+          <w:szCs w:val="22"/>
+          <w:lang w:val="es-ES"/>
+        </w:rPr>
+        <w:t> Identificar a estos actores no equivale a negociar con ellos. La CRV no reconoce como interlocutores válidos a actores cuya autoridad se basa en el control territorial por medios no legítimos. Si su presencia representa un riesgo para el equipo o la comunidad, debe activarse el protocolo de seguridad de la filial.</w:t>
+      </w:r>
+    </w:p>
+    <w:p>
+      <w:pPr>
+        <w:pStyle w:val="Ttulo2"/>
+        <w:rPr>
+          <w:rFonts w:ascii="Arial" w:hAnsi="Arial" w:cs="Arial"/>
+          <w:b/>
+          <w:bCs/>
+          <w:sz w:val="22"/>
+          <w:szCs w:val="22"/>
+        </w:rPr>
+      </w:pPr>
+      <w:r>
+        <w:rPr>
+          <w:rFonts w:ascii="Arial" w:hAnsi="Arial" w:cs="Arial"/>
+          <w:b/>
+          <w:bCs/>
+          <w:color w:val="auto"/>
+          <w:sz w:val="22"/>
+          <w:szCs w:val="22"/>
+          <w:lang w:val="es-ES"/>
+        </w:rPr>
+        <w:t>4</w:t>
       </w:r>
       <w:r>
         <w:rPr>
@@ -8369,7 +8368,7 @@
           <w:szCs w:val="22"/>
           <w:lang w:val="es-ES"/>
         </w:rPr>
-        <w:t>3</w:t>
+        <w:t>5</w:t>
       </w:r>
       <w:r>
         <w:rPr>
@@ -8766,7 +8765,7 @@
           <w:szCs w:val="22"/>
           <w:lang w:val="es-ES"/>
         </w:rPr>
-        <w:t>4.</w:t>
+        <w:t>6.</w:t>
       </w:r>
       <w:r>
         <w:rPr>
@@ -9079,7 +9078,7 @@
           <w:szCs w:val="22"/>
           <w:lang w:val="es-ES"/>
         </w:rPr>
-        <w:t>5</w:t>
+        <w:t>7</w:t>
       </w:r>
       <w:r>
         <w:rPr>
@@ -9291,7 +9290,7 @@
           <w:szCs w:val="22"/>
           <w:lang w:val="es-ES"/>
         </w:rPr>
-        <w:t>6.</w:t>
+        <w:t>8.</w:t>
       </w:r>
       <w:r>
         <w:rPr>
@@ -9672,7 +9671,7 @@
           <w:szCs w:val="22"/>
           <w:lang w:val="es-ES"/>
         </w:rPr>
-        <w:t>7</w:t>
+        <w:t>9</w:t>
       </w:r>
       <w:r>
         <w:rPr>
@@ -10075,7 +10074,7 @@
           <w:szCs w:val="22"/>
           <w:lang w:val="es-ES"/>
         </w:rPr>
-        <w:t xml:space="preserve">8. </w:t>
+        <w:t xml:space="preserve">10. </w:t>
       </w:r>
       <w:r>
         <w:rPr>
@@ -10443,7 +10442,7 @@
           <w:szCs w:val="22"/>
           <w:lang w:val="es-ES"/>
         </w:rPr>
-        <w:t>9</w:t>
+        <w:t>11</w:t>
       </w:r>
       <w:r>
         <w:rPr>

</xml_diff>